<commit_message>
Hoan thien toan dien co che Danh ba Ban be va Bao mat Nhom chat kieu Telegram, dong bo bao cao Chuong 4 va Chuong 5
</commit_message>
<xml_diff>
--- a/BÁO CÁO ĐỒ ÁN CHUYÊN NGÀNH - CHƯƠNG 4 - NHÓM 5.docx
+++ b/BÁO CÁO ĐỒ ÁN CHUYÊN NGÀNH - CHƯƠNG 4 - NHÓM 5.docx
@@ -1882,13 +1882,7 @@
         <w:jc w:val="both"/>
       </w:pPr>
       <w:r>
-        <w:rPr>
-          <w:rFonts w:ascii="Times New Roman" w:hAnsi="Times New Roman"/>
-          <w:b w:val="0"/>
-          <w:i w:val="0"/>
-          <w:sz w:val="26"/>
-        </w:rPr>
-        <w:t>Hệ thống sử dụng cơ sở dữ liệu quan hệ SQLite gồm 6 bảng dữ liệu được chuẩn hóa ở dạng chuẩn 3NF (Third Normal Form) nhằm bảo đảm không dư thừa và tối ưu hóa tốc độ truy vấn:</w:t>
+        <w:t>Hệ thống sử dụng cơ sở dữ liệu quan hệ SQLite gồm 7 bảng dữ liệu được chuẩn hóa ở dạng chuẩn 3NF (Third Normal Form) nhằm bảo đảm không dư thừa và tối ưu hóa tốc độ truy vấn:</w:t>
       </w:r>
     </w:p>
     <w:p>
@@ -6128,6 +6122,350 @@
       </w:tr>
     </w:tbl>
     <w:p>
+      <w:r>
+        <w:rPr>
+          <w:b/>
+        </w:rPr>
+        <w:t>Bảng 4.7: Cấu trúc bảng Danh bạ bạn bè kiểu Telegram (friends)</w:t>
+      </w:r>
+    </w:p>
+    <w:tbl>
+      <w:tblPr>
+        <w:tblW w:type="auto" w:w="0"/>
+        <w:tblLook w:firstColumn="1" w:firstRow="1" w:lastColumn="0" w:lastRow="0" w:noHBand="0" w:noVBand="1" w:val="04A0"/>
+      </w:tblPr>
+      <w:tblGrid>
+        <w:gridCol w:w="1814"/>
+        <w:gridCol w:w="1814"/>
+        <w:gridCol w:w="1814"/>
+        <w:gridCol w:w="1814"/>
+        <w:gridCol w:w="1814"/>
+      </w:tblGrid>
+      <w:tr>
+        <w:tc>
+          <w:tcPr>
+            <w:tcW w:type="dxa" w:w="1814"/>
+          </w:tcPr>
+          <w:p>
+            <w:r>
+              <w:rPr>
+                <w:b/>
+              </w:rPr>
+              <w:t>Tên trường (Column)</w:t>
+            </w:r>
+          </w:p>
+        </w:tc>
+        <w:tc>
+          <w:tcPr>
+            <w:tcW w:type="dxa" w:w="1814"/>
+          </w:tcPr>
+          <w:p>
+            <w:r>
+              <w:rPr>
+                <w:b/>
+              </w:rPr>
+              <w:t>Kiểu dữ liệu</w:t>
+            </w:r>
+          </w:p>
+        </w:tc>
+        <w:tc>
+          <w:tcPr>
+            <w:tcW w:type="dxa" w:w="1814"/>
+          </w:tcPr>
+          <w:p>
+            <w:r>
+              <w:rPr>
+                <w:b/>
+              </w:rPr>
+              <w:t>Khóa (Key)</w:t>
+            </w:r>
+          </w:p>
+        </w:tc>
+        <w:tc>
+          <w:tcPr>
+            <w:tcW w:type="dxa" w:w="1814"/>
+          </w:tcPr>
+          <w:p>
+            <w:r>
+              <w:rPr>
+                <w:b/>
+              </w:rPr>
+              <w:t>Ràng buộc (Constraint)</w:t>
+            </w:r>
+          </w:p>
+        </w:tc>
+        <w:tc>
+          <w:tcPr>
+            <w:tcW w:type="dxa" w:w="1814"/>
+          </w:tcPr>
+          <w:p>
+            <w:r>
+              <w:rPr>
+                <w:b/>
+              </w:rPr>
+              <w:t>Diễn giải ý nghĩa</w:t>
+            </w:r>
+          </w:p>
+        </w:tc>
+      </w:tr>
+      <w:tr>
+        <w:tc>
+          <w:tcPr>
+            <w:tcW w:type="dxa" w:w="1814"/>
+          </w:tcPr>
+          <w:p>
+            <w:r>
+              <w:t>id</w:t>
+            </w:r>
+          </w:p>
+        </w:tc>
+        <w:tc>
+          <w:tcPr>
+            <w:tcW w:type="dxa" w:w="1814"/>
+          </w:tcPr>
+          <w:p>
+            <w:r>
+              <w:t>INTEGER</w:t>
+            </w:r>
+          </w:p>
+        </w:tc>
+        <w:tc>
+          <w:tcPr>
+            <w:tcW w:type="dxa" w:w="1814"/>
+          </w:tcPr>
+          <w:p>
+            <w:r>
+              <w:t>PK</w:t>
+            </w:r>
+          </w:p>
+        </w:tc>
+        <w:tc>
+          <w:tcPr>
+            <w:tcW w:type="dxa" w:w="1814"/>
+          </w:tcPr>
+          <w:p>
+            <w:r>
+              <w:t>AUTOINCREMENT</w:t>
+            </w:r>
+          </w:p>
+        </w:tc>
+        <w:tc>
+          <w:tcPr>
+            <w:tcW w:type="dxa" w:w="1814"/>
+          </w:tcPr>
+          <w:p>
+            <w:r>
+              <w:t>Định danh bản ghi quan hệ bạn bè</w:t>
+            </w:r>
+          </w:p>
+        </w:tc>
+      </w:tr>
+      <w:tr>
+        <w:tc>
+          <w:tcPr>
+            <w:tcW w:type="dxa" w:w="1814"/>
+          </w:tcPr>
+          <w:p>
+            <w:r>
+              <w:t>user_id</w:t>
+            </w:r>
+          </w:p>
+        </w:tc>
+        <w:tc>
+          <w:tcPr>
+            <w:tcW w:type="dxa" w:w="1814"/>
+          </w:tcPr>
+          <w:p>
+            <w:r>
+              <w:t>INTEGER</w:t>
+            </w:r>
+          </w:p>
+        </w:tc>
+        <w:tc>
+          <w:tcPr>
+            <w:tcW w:type="dxa" w:w="1814"/>
+          </w:tcPr>
+          <w:p>
+            <w:r>
+              <w:t>FK</w:t>
+            </w:r>
+          </w:p>
+        </w:tc>
+        <w:tc>
+          <w:tcPr>
+            <w:tcW w:type="dxa" w:w="1814"/>
+          </w:tcPr>
+          <w:p>
+            <w:r>
+              <w:t>NOT NULL</w:t>
+            </w:r>
+          </w:p>
+        </w:tc>
+        <w:tc>
+          <w:tcPr>
+            <w:tcW w:type="dxa" w:w="1814"/>
+          </w:tcPr>
+          <w:p>
+            <w:r>
+              <w:t>Mã người dùng sở hữu danh bạ</w:t>
+            </w:r>
+          </w:p>
+        </w:tc>
+      </w:tr>
+      <w:tr>
+        <w:tc>
+          <w:tcPr>
+            <w:tcW w:type="dxa" w:w="1814"/>
+          </w:tcPr>
+          <w:p>
+            <w:r>
+              <w:t>friend_id</w:t>
+            </w:r>
+          </w:p>
+        </w:tc>
+        <w:tc>
+          <w:tcPr>
+            <w:tcW w:type="dxa" w:w="1814"/>
+          </w:tcPr>
+          <w:p>
+            <w:r>
+              <w:t>INTEGER</w:t>
+            </w:r>
+          </w:p>
+        </w:tc>
+        <w:tc>
+          <w:tcPr>
+            <w:tcW w:type="dxa" w:w="1814"/>
+          </w:tcPr>
+          <w:p>
+            <w:r>
+              <w:t>FK</w:t>
+            </w:r>
+          </w:p>
+        </w:tc>
+        <w:tc>
+          <w:tcPr>
+            <w:tcW w:type="dxa" w:w="1814"/>
+          </w:tcPr>
+          <w:p>
+            <w:r>
+              <w:t>NOT NULL</w:t>
+            </w:r>
+          </w:p>
+        </w:tc>
+        <w:tc>
+          <w:tcPr>
+            <w:tcW w:type="dxa" w:w="1814"/>
+          </w:tcPr>
+          <w:p>
+            <w:r>
+              <w:t>Mã người bạn được lưu trong danh bạ</w:t>
+            </w:r>
+          </w:p>
+        </w:tc>
+      </w:tr>
+      <w:tr>
+        <w:tc>
+          <w:tcPr>
+            <w:tcW w:type="dxa" w:w="1814"/>
+          </w:tcPr>
+          <w:p>
+            <w:r>
+              <w:t>status</w:t>
+            </w:r>
+          </w:p>
+        </w:tc>
+        <w:tc>
+          <w:tcPr>
+            <w:tcW w:type="dxa" w:w="1814"/>
+          </w:tcPr>
+          <w:p>
+            <w:r>
+              <w:t>TEXT</w:t>
+            </w:r>
+          </w:p>
+        </w:tc>
+        <w:tc>
+          <w:tcPr>
+            <w:tcW w:type="dxa" w:w="1814"/>
+          </w:tcPr>
+          <w:p>
+            <w:r/>
+          </w:p>
+        </w:tc>
+        <w:tc>
+          <w:tcPr>
+            <w:tcW w:type="dxa" w:w="1814"/>
+          </w:tcPr>
+          <w:p>
+            <w:r>
+              <w:t>DEFAULT 'accepted'</w:t>
+            </w:r>
+          </w:p>
+        </w:tc>
+        <w:tc>
+          <w:tcPr>
+            <w:tcW w:type="dxa" w:w="1814"/>
+          </w:tcPr>
+          <w:p>
+            <w:r>
+              <w:t>Trạng thái kết bạn (accepted/pending)</w:t>
+            </w:r>
+          </w:p>
+        </w:tc>
+      </w:tr>
+      <w:tr>
+        <w:tc>
+          <w:tcPr>
+            <w:tcW w:type="dxa" w:w="1814"/>
+          </w:tcPr>
+          <w:p>
+            <w:r>
+              <w:t>created_at</w:t>
+            </w:r>
+          </w:p>
+        </w:tc>
+        <w:tc>
+          <w:tcPr>
+            <w:tcW w:type="dxa" w:w="1814"/>
+          </w:tcPr>
+          <w:p>
+            <w:r>
+              <w:t>DATETIME</w:t>
+            </w:r>
+          </w:p>
+        </w:tc>
+        <w:tc>
+          <w:tcPr>
+            <w:tcW w:type="dxa" w:w="1814"/>
+          </w:tcPr>
+          <w:p>
+            <w:r/>
+          </w:p>
+        </w:tc>
+        <w:tc>
+          <w:tcPr>
+            <w:tcW w:type="dxa" w:w="1814"/>
+          </w:tcPr>
+          <w:p>
+            <w:r>
+              <w:t>DEFAULT CURRENT_TIMESTAMP</w:t>
+            </w:r>
+          </w:p>
+        </w:tc>
+        <w:tc>
+          <w:tcPr>
+            <w:tcW w:type="dxa" w:w="1814"/>
+          </w:tcPr>
+          <w:p>
+            <w:r>
+              <w:t>Thời điểm thêm vào danh bạ</w:t>
+            </w:r>
+          </w:p>
+        </w:tc>
+      </w:tr>
+    </w:tbl>
+    <w:p>
       <w:pPr>
         <w:spacing w:before="280" w:after="120" w:line="288" w:lineRule="auto"/>
         <w:jc w:val="left"/>

</xml_diff>